<commit_message>
Update user guide to v2.4 with "Departed" status documentation
Add Departed status explanation, update color guide, add Exit Date to
master data requirements, and include Departed in no-penalty statuses list.

Co-Authored-By: Claude Opus 4.6 <noreply@anthropic.com>
</commit_message>
<xml_diff>
--- a/Streamlit_User_Guide.docx
+++ b/Streamlit_User_Guide.docx
@@ -74,11 +74,7 @@
         <w:jc w:val="center"/>
       </w:pPr>
       <w:r>
-        <w:rPr>
-          <w:color w:val="999999"/>
-          <w:sz w:val="20"/>
-        </w:rPr>
-        <w:t>Version 2.3 — February 2026</w:t>
+        <w:t>Version 2.4 — February 2026</w:t>
       </w:r>
     </w:p>
     <w:p>
@@ -174,11 +170,7 @@
         <w:pStyle w:val="ListNumber"/>
       </w:pPr>
       <w:r>
-        <w:rPr>
-          <w:i/>
-          <w:sz w:val="20"/>
-        </w:rPr>
-        <w:t xml:space="preserve">     New: "Not Yet Hired" status for mid-period hires</w:t>
+        <w:t xml:space="preserve">     New: "Not Yet Hired" and "Departed" statuses for mid-period hires and exits</w:t>
       </w:r>
     </w:p>
     <w:p>
@@ -268,7 +260,7 @@
         <w:pStyle w:val="ListBullet"/>
       </w:pPr>
       <w:r>
-        <w:t>Contains employee information: CRM, Name, Department, National ID, Vendor, PS ID, Join Date</w:t>
+        <w:t>Contains employee information: CRM, Name, Department, National ID, Vendor, PS ID, Join Date, Exit Date</w:t>
       </w:r>
     </w:p>
     <w:p>
@@ -592,23 +584,12 @@
     </w:p>
     <w:p>
       <w:r>
-        <w:rPr>
-          <w:sz w:val="20"/>
-        </w:rPr>
-        <w:t xml:space="preserve">Not Yet Hired: If an employee was hired after the report start date, all dates before their join date will show </w:t>
+        <w:t>Not Yet Hired: If an employee was hired after the report start date, all dates before their join date will show "Not Yet Hired" in silver italic. These days carry no penalty and are counted as normal days.</w:t>
       </w:r>
+    </w:p>
+    <w:p>
       <w:r>
-        <w:rPr>
-          <w:b/>
-          <w:sz w:val="20"/>
-        </w:rPr>
-        <w:t>"Not Yet Hired"</w:t>
-      </w:r>
-      <w:r>
-        <w:rPr>
-          <w:sz w:val="20"/>
-        </w:rPr>
-        <w:t xml:space="preserve"> in blue-gray italic. These days carry no penalty and are counted as normal days.</w:t>
+        <w:t>Departed: If an employee's exit date falls within the report period, all dates after their exit date will show "Departed" in the same silver italic style. These days carry no penalty and are counted as normal days. Weekends after the exit date still display as "Weekend".</w:t>
       </w:r>
     </w:p>
     <w:p>
@@ -1876,7 +1857,7 @@
     </w:p>
     <w:p>
       <w:r>
-        <w:t>Normal, Late (Approved), Early Departure (Approved), Weekend, Not Yet Hired, Annual Leave, Casual Leave, Marriage Leave, Paternity Leave, Maternity Leave, Bereavement Leave, Military Call Leave, and all Refund statuses.</w:t>
+        <w:t>Normal, Late (Approved), Early Departure (Approved), Weekend, Not Yet Hired, Departed, Annual Leave, Casual Leave, Marriage Leave, Paternity Leave, Maternity Leave, Bereavement Leave, Military Call Leave, and all Refund statuses.</w:t>
       </w:r>
     </w:p>
     <w:p>
@@ -2486,10 +2467,7 @@
           </w:tcPr>
           <w:p>
             <w:r>
-              <w:rPr>
-                <w:sz w:val="18"/>
-              </w:rPr>
-              <w:t>Light Gray</w:t>
+              <w:t>Silver</w:t>
             </w:r>
           </w:p>
         </w:tc>
@@ -2499,10 +2477,7 @@
           </w:tcPr>
           <w:p>
             <w:r>
-              <w:rPr>
-                <w:sz w:val="18"/>
-              </w:rPr>
-              <w:t>Resigned</w:t>
+              <w:t>Departed (italic)</w:t>
             </w:r>
           </w:p>
         </w:tc>
@@ -2512,10 +2487,7 @@
           </w:tcPr>
           <w:p>
             <w:r>
-              <w:rPr>
-                <w:sz w:val="18"/>
-              </w:rPr>
-              <w:t>Resigned</w:t>
+              <w:t>Dates after employee exit date</w:t>
             </w:r>
           </w:p>
         </w:tc>
@@ -2527,10 +2499,7 @@
           </w:tcPr>
           <w:p>
             <w:r>
-              <w:rPr>
-                <w:sz w:val="20"/>
-              </w:rPr>
-              <w:t>Blue-Gray (Silver)</w:t>
+              <w:t>Silver (same as Departed)</w:t>
             </w:r>
           </w:p>
         </w:tc>
@@ -2540,9 +2509,6 @@
           </w:tcPr>
           <w:p>
             <w:r>
-              <w:rPr>
-                <w:sz w:val="20"/>
-              </w:rPr>
               <w:t>Not Yet Hired (italic)</w:t>
             </w:r>
           </w:p>
@@ -2553,9 +2519,6 @@
           </w:tcPr>
           <w:p>
             <w:r>
-              <w:rPr>
-                <w:sz w:val="20"/>
-              </w:rPr>
               <w:t>Dates before employee join date</w:t>
             </w:r>
           </w:p>
@@ -2705,11 +2668,7 @@
         <w:jc w:val="center"/>
       </w:pPr>
       <w:r>
-        <w:rPr>
-          <w:color w:val="999999"/>
-          <w:sz w:val="18"/>
-        </w:rPr>
-        <w:t>Attendance Dashboard v2.3 — Web Edition</w:t>
+        <w:t>Attendance Dashboard v2.4 — Web Edition</w:t>
       </w:r>
     </w:p>
     <w:p>

</xml_diff>